<commit_message>
Re-evaluacion con el prompt nuevo: revision manual 12/12 sin agregados
- eval/resultados.json: 15/15, hit@3 1.0 con rerank, juez 4.92/4.75/5.00
- Reporte (HTML y Word), README y documento_proceso con los numeros nuevos
- Caso de tickets actualizado: ya no afirma con el articulo equivocado,
  pero no responde la pregunta (sigue yendo a revision)
- Hallazgo nuevo: el prompt estricto vuelve las respuestas mas literales
</commit_message>
<xml_diff>
--- a/docs/reporte_evaluacion.docx
+++ b/docs/reporte_evaluacion.docx
@@ -775,7 +775,7 @@
               <w:rPr>
                 <w:sz w:val="20"/>
               </w:rPr>
-              <w:t>4.92</w:t>
+              <w:t>5.00</w:t>
             </w:r>
           </w:p>
         </w:tc>
@@ -805,7 +805,7 @@
               <w:rPr>
                 <w:sz w:val="20"/>
               </w:rPr>
-              <w:t>8/12</w:t>
+              <w:t>12/12</w:t>
             </w:r>
           </w:p>
         </w:tc>
@@ -1478,7 +1478,7 @@
               <w:rPr>
                 <w:sz w:val="20"/>
               </w:rPr>
-              <w:t>4.83 / 4.75 / 4.92</w:t>
+              <w:t>4.92 / 4.75 / 5.00</w:t>
             </w:r>
           </w:p>
         </w:tc>
@@ -1508,7 +1508,7 @@
               <w:rPr>
                 <w:sz w:val="20"/>
               </w:rPr>
-              <w:t>8 de 12</w:t>
+              <w:t>12 de 12</w:t>
             </w:r>
           </w:p>
         </w:tc>
@@ -1966,7 +1966,7 @@
                 <w:color w:val="15803D"/>
                 <w:sz w:val="17"/>
               </w:rPr>
-              <w:t>✓ Correcta</w:t>
+              <w:t>✓ Correcta (copia el artículo casi textual)</w:t>
             </w:r>
           </w:p>
         </w:tc>
@@ -2065,10 +2065,10 @@
             <w:r/>
             <w:r>
               <w:rPr>
-                <w:color w:val="B91C1C"/>
+                <w:color w:val="15803D"/>
                 <w:sz w:val="17"/>
               </w:rPr>
-              <w:t>✗ Agrega "no se descuenta de las vacaciones"</w:t>
+              <w:t>✓ Correcta</w:t>
             </w:r>
           </w:p>
         </w:tc>
@@ -2257,7 +2257,7 @@
               <w:rPr>
                 <w:sz w:val="17"/>
               </w:rPr>
-              <w:t>5/4/5</w:t>
+              <w:t>5/5/5</w:t>
             </w:r>
           </w:p>
         </w:tc>
@@ -2269,10 +2269,10 @@
             <w:r/>
             <w:r>
               <w:rPr>
-                <w:color w:val="B91C1C"/>
+                <w:color w:val="15803D"/>
                 <w:sz w:val="17"/>
               </w:rPr>
-              <w:t>✗ Inventa para qué sirve el preaviso y usa un dato del art. 232</w:t>
+              <w:t>✓ Correcta</w:t>
             </w:r>
           </w:p>
         </w:tc>
@@ -2371,10 +2371,10 @@
             <w:r/>
             <w:r>
               <w:rPr>
-                <w:color w:val="B91C1C"/>
+                <w:color w:val="15803D"/>
                 <w:sz w:val="17"/>
               </w:rPr>
-              <w:t>✗ Agrega "sin perder su remuneración" (art. 159, no recuperado)</w:t>
+              <w:t>✓ Correcta</w:t>
             </w:r>
           </w:p>
         </w:tc>
@@ -3073,7 +3073,7 @@
               <w:rPr>
                 <w:sz w:val="17"/>
               </w:rPr>
-              <w:t>4/5/4</w:t>
+              <w:t>5/5/5</w:t>
             </w:r>
           </w:p>
         </w:tc>
@@ -3175,7 +3175,7 @@
               <w:rPr>
                 <w:sz w:val="17"/>
               </w:rPr>
-              <w:t>5/5/5</w:t>
+              <w:t>5/4/5</w:t>
             </w:r>
           </w:p>
         </w:tc>
@@ -3190,7 +3190,7 @@
                 <w:color w:val="B91C1C"/>
                 <w:sz w:val="17"/>
               </w:rPr>
-              <w:t>✗ Cita el art. 131 para algo que dice el 105</w:t>
+              <w:t>✗ Describe el art. 131 (descuentos) pero no responde la pregunta</w:t>
             </w:r>
           </w:p>
         </w:tc>
@@ -3253,12 +3253,12 @@
                 <w:b/>
                 <w:color w:val="B45309"/>
               </w:rPr>
-              <w:t>El modelo agrega cosas que no están en el contexto</w:t>
+              <w:t>El modelo agregaba cosas que no estaban en el contexto</w:t>
             </w:r>
           </w:p>
           <w:p>
             <w:r>
-              <w:t>Esta fue la sorpresa más grande. En 3 de las 10 preguntas respondibles y específicas, el modelo agregó alguna frase que no estaba en los artículos que le pasé.</w:t>
+              <w:t>Esta fue la sorpresa más grande. En la primera corrida de esta evaluación, leyendo las respuestas a mano, encontré que en 3 de las 10 respondibles y específicas el modelo agregaba alguna frase que no estaba en los artículos que le pasé.</w:t>
             </w:r>
           </w:p>
         </w:tc>
@@ -3266,50 +3266,22 @@
     </w:tbl>
     <w:p/>
     <w:p>
-      <w:pPr>
-        <w:pStyle w:val="ListBullet"/>
-      </w:pPr>
+      <w:r>
+        <w:t>Por ejemplo, en la del preaviso (#6) explicaba que "este plazo es para que el trabajador pueda buscar otro empleo", algo que la ley no dice, y daba el monto de la indemnización "según el artículo 231", cuando ese dato está en el 232, que ni siquiera se había recuperado. Las respuestas eran correctas en lo principal y las frases agregadas sonaban razonables, así que nadie las nota si no compara línea por línea.</w:t>
+      </w:r>
+    </w:p>
+    <w:p>
+      <w:r>
+        <w:t xml:space="preserve">Agregué una regla al prompt: </w:t>
+      </w:r>
       <w:r>
         <w:rPr>
           <w:b/>
         </w:rPr>
-        <w:t>#4:</w:t>
+        <w:t>no agregar explicaciones ni consecuencias que no estén escritas en los artículos del contexto, aunque sean ciertas</w:t>
       </w:r>
       <w:r>
-        <w:t xml:space="preserve"> "no se descuenta de las vacaciones anuales". No aparece en ningún artículo del contexto.</w:t>
-      </w:r>
-    </w:p>
-    <w:p>
-      <w:pPr>
-        <w:pStyle w:val="ListBullet"/>
-      </w:pPr>
-      <w:r>
-        <w:rPr>
-          <w:b/>
-        </w:rPr>
-        <w:t>#6:</w:t>
-      </w:r>
-      <w:r>
-        <w:t xml:space="preserve"> "este plazo es para que el trabajador pueda buscar otro empleo". Es una explicación que inventó el modelo. Además dice que la indemnización es de un mes de sueldo "según el artículo 231", pero eso está en el 232, que ni siquiera se recuperó.</w:t>
-      </w:r>
-    </w:p>
-    <w:p>
-      <w:pPr>
-        <w:pStyle w:val="ListBullet"/>
-      </w:pPr>
-      <w:r>
-        <w:rPr>
-          <w:b/>
-        </w:rPr>
-        <w:t>#7:</w:t>
-      </w:r>
-      <w:r>
-        <w:t xml:space="preserve"> "sin perder su remuneración". Es verdad (lo dice el art. 159), pero el modelo no tenía ese artículo: lo sacó de lo que ya sabía.</w:t>
-      </w:r>
-    </w:p>
-    <w:p>
-      <w:r>
-        <w:t>Lo peligroso es que las tres respuestas son correctas en lo principal y las frases agregadas suenan razonables, así que nadie las nota si no compara línea por línea. Mi prompt dice "respondé únicamente con la información del contexto", y aun así pasa.</w:t>
+        <w:t>. Volví a correr la evaluación y ninguna respuesta agregó nada: 12 de 12. Los números de este reporte son los de esa segunda corrida.</w:t>
       </w:r>
     </w:p>
     <w:p>
@@ -3322,12 +3294,25 @@
     </w:p>
     <w:p>
       <w:r>
-        <w:t>El LLM-as-a-Judge le puso "fundamentada: 5" a las tres respuestas de arriba, y también a la de los tickets de comida (#15). Esa respuesta cita el art. 131, que trata sobre descuentos al sueldo, para una regla que en realidad está en el 105 ("el salario debe ser satisfecho en dinero"). En la #6, el comentario del juez dice que la respuesta "no menciona que el plazo de un mes se aplica a una antigüedad de hasta 5 años", y sí lo menciona. Y en la #9 le bajó el puntaje de relevancia por explicar la excepción de la empresa familiar, que a mí me parece información útil.</w:t>
+        <w:t>En la primera corrida, el LLM-as-a-Judge les había puesto "fundamentada: 5" a esas tres respuestas con frases agregadas. También a la de los tickets de comida (#15), que en ese momento decía que no se podía "según el artículo 131", cuando el 131 trata sobre descuentos al sueldo y lo que dice que el salario se paga en dinero es el 105. Ahora el juez y mi revisión coinciden, pero eso no lo hubiera sabido sin leer yo las respuestas. Y en la #9 le sigue bajando el puntaje de relevancia por explicar la excepción de la empresa familiar, que a mí me parece información útil.</w:t>
       </w:r>
     </w:p>
     <w:p>
       <w:r>
-        <w:t>Mi conclusión es que usar el mismo modelo como juez tiene un problema: comparte las cegueras del modelo que genera. El promedio de 4.92 en "fundamentada" me hubiera hecho creer que el sistema no inventa nada, y la revisión manual dio 8 de 12. Esto también me confirmó que el Human in the Loop tiene que ser una persona y no otro modelo: el caso de los tickets lo ataja la revisión humana, no el juez.</w:t>
+        <w:t>Mi conclusión es que usar el mismo modelo como juez tiene un problema: comparte las cegueras del modelo que genera. Esto también me confirmó que el Human in the Loop tiene que ser una persona y no otro modelo.</w:t>
+      </w:r>
+    </w:p>
+    <w:p>
+      <w:pPr>
+        <w:pStyle w:val="Heading2"/>
+      </w:pPr>
+      <w:r>
+        <w:t>Un prompt más estricto también tiene un costo</w:t>
+      </w:r>
+    </w:p>
+    <w:p>
+      <w:r>
+        <w:t>Con la regla nueva, el modelo se volvió más literal. En la #3 (hora extra) copió el artículo casi palabra por palabra, incluso un error de tipeo que tiene la ley ("si se tratare del días comunes"). Es correcto, pero para alguien sin formación jurídica es menos claro. Y en la #15 ya no afirma nada con el artículo equivocado, pero tampoco responde la pregunta: describe lo que dice el 131 sobre descuentos. Por suerte esa respuesta igual queda en revisión humana, y el revisor la rechazaría. Aprendí que ajustar un prompt es un equilibrio: lo que gané en fidelidad lo perdí un poco en claridad.</w:t>
       </w:r>
     </w:p>
     <w:p>
@@ -3350,7 +3335,7 @@
         <w:t>temperature=0</w:t>
       </w:r>
       <w:r>
-        <w:t xml:space="preserve">. En esta corrida pasó en la #6: falló dos veces seguidas y salió bien al tercer intento. Por eso el sistema ahora detecta ese tipo de salida, reintenta hasta 3 veces y, si no sale, devuelve un error en vez de guardar basura en el caché. Aprendí que </w:t>
+        <w:t xml:space="preserve">. En la primera corrida de la evaluación pasó en la #6: falló dos veces seguidas y salió bien al tercer intento. Por eso el sistema ahora detecta ese tipo de salida, reintenta hasta 3 veces y, si no sale, devuelve un error en vez de guardar basura en el caché. Aprendí que </w:t>
       </w:r>
       <w:r>
         <w:rPr>
@@ -3411,10 +3396,10 @@
         <w:rPr>
           <w:b/>
         </w:rPr>
-        <w:t>Ajustar el prompt</w:t>
+        <w:t>Buscar el equilibrio del prompt:</w:t>
       </w:r>
       <w:r>
-        <w:t xml:space="preserve"> para que no agregue explicaciones, finalidades ni consecuencias que no estén escritas en los artículos, y volver a medir.</w:t>
+        <w:t xml:space="preserve"> que no agregue nada fuera del contexto, pero que explique con palabras simples en vez de copiar el artículo.</w:t>
       </w:r>
     </w:p>
     <w:p>
@@ -3469,7 +3454,7 @@
     </w:p>
     <w:p>
       <w:r>
-        <w:t>El retrieval funciona bien: con reranking encontró el artículo correcto en las 11 preguntas, y el sistema se comportó como debía en las 15. Donde hay que tener más cuidado es en la generación: las respuestas son correctas en lo principal, pero el modelo tiende a completar con información que no está en el contexto.</w:t>
+        <w:t>El retrieval funciona bien: con reranking encontró el artículo correcto en las 11 preguntas, y el sistema se comportó como debía en las 15. Donde más aprendí fue en la generación: el modelo tendía a completar con información que no estaba en el contexto, y con una regla más en el prompt las 12 respuestas se quedaron dentro de lo que dice la ley.</w:t>
       </w:r>
     </w:p>
     <w:p>

</xml_diff>